<commit_message>
Add Lesson 0002: Recognising and Responding to Saying Hello
Ms Lan + Ms Emma, A0/Pre-A1, Social Basics domain. Two distinct
greeting exchanges (morning "Good morning"/goodbye, then an evening
"Hi"/"Good evening"/"Good night" encounter) so the lesson covers more
than one real greeting register without padding or duplicating
content. 199 English words (target 180-260), 23 turns, zero
contractions, zero duplicates, strict speaker alternation.

Co-Authored-By: Claude Sonnet 5 <noreply@anthropic.com>
Claude-Session: https://claude.ai/code/session_01R4NonxRLiC4smHw3pUNAKL
</commit_message>
<xml_diff>
--- a/practical-everyday-english/restart/manuscript/EVERYDAY_ENGLISH_REFLEX_BOOK.docx
+++ b/practical-everyday-english/restart/manuscript/EVERYDAY_ENGLISH_REFLEX_BOOK.docx
@@ -794,8 +794,841 @@
         <w:t>Không có gì đâu, chị Lan. Chúc chị buổi khám tốt đẹp.</w:t>
       </w:r>
     </w:p>
+    <w:p>
+      <w:pPr>
+        <w:sectPr>
+          <w:footerReference w:type="default" r:id="rId9"/>
+          <w:pgSz w:w="11906" w:h="16838"/>
+          <w:pgMar w:top="1020" w:right="1134" w:bottom="1020" w:left="1134" w:header="720" w:footer="720" w:gutter="0"/>
+          <w:cols w:space="720"/>
+          <w:docGrid w:linePitch="360"/>
+        </w:sectPr>
+      </w:pPr>
+    </w:p>
+    <w:p>
+      <w:pPr>
+        <w:jc w:val="center"/>
+      </w:pPr>
+      <w:r>
+        <w:rPr>
+          <w:rFonts w:ascii="Arial" w:hAnsi="Arial"/>
+          <w:b/>
+          <w:color w:val="1F3864"/>
+          <w:sz w:val="24"/>
+        </w:rPr>
+        <w:t>EVERYDAY ENGLISH REFLEX</w:t>
+      </w:r>
+    </w:p>
+    <w:p>
+      <w:pPr>
+        <w:spacing w:after="160"/>
+        <w:jc w:val="center"/>
+      </w:pPr>
+      <w:r>
+        <w:rPr>
+          <w:rFonts w:ascii="Arial" w:hAnsi="Arial"/>
+          <w:i/>
+          <w:color w:val="444444"/>
+          <w:sz w:val="19"/>
+        </w:rPr>
+        <w:t>GIAO TIẾP PHẢN XẠ THỰC TẾ</w:t>
+      </w:r>
+    </w:p>
+    <w:tbl>
+      <w:tblPr>
+        <w:tblW w:type="auto" w:w="0"/>
+        <w:jc w:val="center"/>
+        <w:tblLayout w:type="fixed"/>
+        <w:tblLook w:firstColumn="1" w:firstRow="1" w:lastColumn="0" w:lastRow="0" w:noHBand="0" w:noVBand="1" w:val="04A0"/>
+      </w:tblPr>
+      <w:tblGrid>
+        <w:gridCol w:w="4819"/>
+        <w:gridCol w:w="4819"/>
+      </w:tblGrid>
+      <w:tr>
+        <w:tc>
+          <w:tcPr>
+            <w:tcW w:type="dxa" w:w="1814"/>
+            <w:shd w:val="clear" w:color="auto" w:fill="1F3864"/>
+          </w:tcPr>
+          <w:p>
+            <w:pPr>
+              <w:jc w:val="center"/>
+            </w:pPr>
+            <w:r>
+              <w:rPr>
+                <w:rFonts w:ascii="Arial" w:hAnsi="Arial"/>
+                <w:b/>
+                <w:color w:val="FFFFFF"/>
+                <w:sz w:val="24"/>
+              </w:rPr>
+              <w:t>A0 / Pre-A1</w:t>
+            </w:r>
+          </w:p>
+          <w:p>
+            <w:pPr>
+              <w:jc w:val="center"/>
+            </w:pPr>
+            <w:r>
+              <w:rPr>
+                <w:rFonts w:ascii="Arial" w:hAnsi="Arial"/>
+                <w:color w:val="FFFFFF"/>
+                <w:sz w:val="16"/>
+              </w:rPr>
+              <w:t>LESSON 0002</w:t>
+            </w:r>
+          </w:p>
+        </w:tc>
+        <w:tc>
+          <w:tcPr>
+            <w:tcW w:type="dxa" w:w="7824"/>
+            <w:shd w:val="clear" w:color="auto" w:fill="D9E2F3"/>
+          </w:tcPr>
+          <w:p>
+            <w:r>
+              <w:rPr>
+                <w:rFonts w:ascii="Arial" w:hAnsi="Arial"/>
+                <w:b/>
+                <w:color w:val="1F3864"/>
+                <w:sz w:val="30"/>
+              </w:rPr>
+              <w:t>Recognising and Responding to Saying Hello</w:t>
+            </w:r>
+          </w:p>
+          <w:p>
+            <w:r>
+              <w:rPr>
+                <w:rFonts w:ascii="Arial" w:hAnsi="Arial"/>
+                <w:i/>
+                <w:color w:val="333333"/>
+                <w:sz w:val="22"/>
+              </w:rPr>
+              <w:t>Giao tiếp nền tảng: greetings &amp; basic social contact — saying hello</w:t>
+            </w:r>
+          </w:p>
+        </w:tc>
+      </w:tr>
+    </w:tbl>
+    <w:p>
+      <w:pPr>
+        <w:spacing w:after="40"/>
+      </w:pPr>
+    </w:p>
+    <w:p>
+      <w:pPr>
+        <w:spacing w:after="160"/>
+      </w:pPr>
+      <w:r>
+        <w:rPr>
+          <w:rFonts w:ascii="Calibri" w:hAnsi="Calibri"/>
+          <w:i/>
+          <w:color w:val="555555"/>
+          <w:sz w:val="19"/>
+        </w:rPr>
+        <w:t>Ms Lan is walking to work in the morning. She sees her neighbour, Ms Emma, outside their building.</w:t>
+      </w:r>
+      <w:r>
+        <w:rPr>
+          <w:rFonts w:ascii="Calibri" w:hAnsi="Calibri"/>
+          <w:i/>
+          <w:color w:val="777777"/>
+          <w:sz w:val="19"/>
+        </w:rPr>
+        <w:t xml:space="preserve">  Chị Lan đang đi bộ đến chỗ làm vào buổi sáng. Chị gặp Emma, hàng xóm của mình, ở ngoài tòa nhà.</w:t>
+      </w:r>
+    </w:p>
+    <w:p>
+      <w:pPr>
+        <w:spacing w:after="160" w:line="312" w:lineRule="auto"/>
+      </w:pPr>
+      <w:r>
+        <w:rPr>
+          <w:rFonts w:ascii="Calibri" w:hAnsi="Calibri"/>
+          <w:b/>
+          <w:color w:val="1F3864"/>
+          <w:sz w:val="22"/>
+        </w:rPr>
+        <w:t xml:space="preserve">Ms Lan: </w:t>
+      </w:r>
+      <w:r>
+        <w:rPr>
+          <w:rFonts w:ascii="Calibri" w:hAnsi="Calibri"/>
+          <w:sz w:val="22"/>
+        </w:rPr>
+        <w:t xml:space="preserve">Good morning, Emma!  </w:t>
+      </w:r>
+      <w:r>
+        <w:rPr>
+          <w:rFonts w:ascii="Calibri" w:hAnsi="Calibri"/>
+          <w:i/>
+          <w:color w:val="3A3A3A"/>
+          <w:sz w:val="22"/>
+        </w:rPr>
+        <w:t>Chào buổi sáng, Emma!</w:t>
+      </w:r>
+    </w:p>
+    <w:p>
+      <w:pPr>
+        <w:spacing w:after="160" w:line="312" w:lineRule="auto"/>
+      </w:pPr>
+      <w:r>
+        <w:rPr>
+          <w:rFonts w:ascii="Calibri" w:hAnsi="Calibri"/>
+          <w:b/>
+          <w:color w:val="1F3864"/>
+          <w:sz w:val="22"/>
+        </w:rPr>
+        <w:t xml:space="preserve">Ms Emma: </w:t>
+      </w:r>
+      <w:r>
+        <w:rPr>
+          <w:rFonts w:ascii="Calibri" w:hAnsi="Calibri"/>
+          <w:sz w:val="22"/>
+        </w:rPr>
+        <w:t xml:space="preserve">Good morning, Lan! It is a lovely day today.  </w:t>
+      </w:r>
+      <w:r>
+        <w:rPr>
+          <w:rFonts w:ascii="Calibri" w:hAnsi="Calibri"/>
+          <w:i/>
+          <w:color w:val="3A3A3A"/>
+          <w:sz w:val="22"/>
+        </w:rPr>
+        <w:t>Chào buổi sáng, Lan! Hôm nay trời đẹp quá.</w:t>
+      </w:r>
+    </w:p>
+    <w:p>
+      <w:pPr>
+        <w:spacing w:after="160" w:line="312" w:lineRule="auto"/>
+      </w:pPr>
+      <w:r>
+        <w:rPr>
+          <w:rFonts w:ascii="Calibri" w:hAnsi="Calibri"/>
+          <w:b/>
+          <w:color w:val="1F3864"/>
+          <w:sz w:val="22"/>
+        </w:rPr>
+        <w:t xml:space="preserve">Ms Lan: </w:t>
+      </w:r>
+      <w:r>
+        <w:rPr>
+          <w:rFonts w:ascii="Calibri" w:hAnsi="Calibri"/>
+          <w:sz w:val="22"/>
+        </w:rPr>
+        <w:t xml:space="preserve">Yes, it is. The weather is very nice for a walk.  </w:t>
+      </w:r>
+      <w:r>
+        <w:rPr>
+          <w:rFonts w:ascii="Calibri" w:hAnsi="Calibri"/>
+          <w:i/>
+          <w:color w:val="3A3A3A"/>
+          <w:sz w:val="22"/>
+        </w:rPr>
+        <w:t>Vâng, đúng vậy. Thời tiết thế này đi bộ rất thích.</w:t>
+      </w:r>
+    </w:p>
+    <w:p>
+      <w:pPr>
+        <w:spacing w:after="160" w:line="312" w:lineRule="auto"/>
+      </w:pPr>
+      <w:r>
+        <w:rPr>
+          <w:rFonts w:ascii="Calibri" w:hAnsi="Calibri"/>
+          <w:b/>
+          <w:color w:val="1F3864"/>
+          <w:sz w:val="22"/>
+        </w:rPr>
+        <w:t xml:space="preserve">Ms Emma: </w:t>
+      </w:r>
+      <w:r>
+        <w:rPr>
+          <w:rFonts w:ascii="Calibri" w:hAnsi="Calibri"/>
+          <w:sz w:val="22"/>
+        </w:rPr>
+        <w:t xml:space="preserve">I agree. I love mornings like this.  </w:t>
+      </w:r>
+      <w:r>
+        <w:rPr>
+          <w:rFonts w:ascii="Calibri" w:hAnsi="Calibri"/>
+          <w:i/>
+          <w:color w:val="3A3A3A"/>
+          <w:sz w:val="22"/>
+        </w:rPr>
+        <w:t>Tôi cũng thấy vậy. Tôi thích những buổi sáng như thế này.</w:t>
+      </w:r>
+    </w:p>
+    <w:p>
+      <w:pPr>
+        <w:spacing w:after="160" w:line="312" w:lineRule="auto"/>
+      </w:pPr>
+      <w:r>
+        <w:rPr>
+          <w:rFonts w:ascii="Calibri" w:hAnsi="Calibri"/>
+          <w:b/>
+          <w:color w:val="1F3864"/>
+          <w:sz w:val="22"/>
+        </w:rPr>
+        <w:t xml:space="preserve">Ms Lan: </w:t>
+      </w:r>
+      <w:r>
+        <w:rPr>
+          <w:rFonts w:ascii="Calibri" w:hAnsi="Calibri"/>
+          <w:sz w:val="22"/>
+        </w:rPr>
+        <w:t xml:space="preserve">How are you this morning?  </w:t>
+      </w:r>
+      <w:r>
+        <w:rPr>
+          <w:rFonts w:ascii="Calibri" w:hAnsi="Calibri"/>
+          <w:i/>
+          <w:color w:val="3A3A3A"/>
+          <w:sz w:val="22"/>
+        </w:rPr>
+        <w:t>Sáng nay chị khỏe không?</w:t>
+      </w:r>
+    </w:p>
+    <w:p>
+      <w:pPr>
+        <w:spacing w:after="160" w:line="312" w:lineRule="auto"/>
+      </w:pPr>
+      <w:r>
+        <w:rPr>
+          <w:rFonts w:ascii="Calibri" w:hAnsi="Calibri"/>
+          <w:b/>
+          <w:color w:val="1F3864"/>
+          <w:sz w:val="22"/>
+        </w:rPr>
+        <w:t xml:space="preserve">Ms Emma: </w:t>
+      </w:r>
+      <w:r>
+        <w:rPr>
+          <w:rFonts w:ascii="Calibri" w:hAnsi="Calibri"/>
+          <w:sz w:val="22"/>
+        </w:rPr>
+        <w:t xml:space="preserve">I am very well, thank you. And how are you?  </w:t>
+      </w:r>
+      <w:r>
+        <w:rPr>
+          <w:rFonts w:ascii="Calibri" w:hAnsi="Calibri"/>
+          <w:i/>
+          <w:color w:val="3A3A3A"/>
+          <w:sz w:val="22"/>
+        </w:rPr>
+        <w:t>Tôi khỏe, cảm ơn chị. Còn chị thì sao?</w:t>
+      </w:r>
+    </w:p>
+    <w:p>
+      <w:pPr>
+        <w:spacing w:after="160" w:line="312" w:lineRule="auto"/>
+      </w:pPr>
+      <w:r>
+        <w:rPr>
+          <w:rFonts w:ascii="Calibri" w:hAnsi="Calibri"/>
+          <w:b/>
+          <w:color w:val="1F3864"/>
+          <w:sz w:val="22"/>
+        </w:rPr>
+        <w:t xml:space="preserve">Ms Lan: </w:t>
+      </w:r>
+      <w:r>
+        <w:rPr>
+          <w:rFonts w:ascii="Calibri" w:hAnsi="Calibri"/>
+          <w:sz w:val="22"/>
+        </w:rPr>
+        <w:t xml:space="preserve">I am fine too, thank you. I am a little tired, but fine.  </w:t>
+      </w:r>
+      <w:r>
+        <w:rPr>
+          <w:rFonts w:ascii="Calibri" w:hAnsi="Calibri"/>
+          <w:i/>
+          <w:color w:val="3A3A3A"/>
+          <w:sz w:val="22"/>
+        </w:rPr>
+        <w:t>Tôi cũng khỏe, cảm ơn chị. Tôi hơi mệt một chút, nhưng vẫn ổn.</w:t>
+      </w:r>
+    </w:p>
+    <w:p>
+      <w:pPr>
+        <w:spacing w:after="160" w:line="312" w:lineRule="auto"/>
+      </w:pPr>
+      <w:r>
+        <w:rPr>
+          <w:rFonts w:ascii="Calibri" w:hAnsi="Calibri"/>
+          <w:b/>
+          <w:color w:val="1F3864"/>
+          <w:sz w:val="22"/>
+        </w:rPr>
+        <w:t xml:space="preserve">Ms Emma: </w:t>
+      </w:r>
+      <w:r>
+        <w:rPr>
+          <w:rFonts w:ascii="Calibri" w:hAnsi="Calibri"/>
+          <w:sz w:val="22"/>
+        </w:rPr>
+        <w:t xml:space="preserve">Oh dear. Are you going to work now?  </w:t>
+      </w:r>
+      <w:r>
+        <w:rPr>
+          <w:rFonts w:ascii="Calibri" w:hAnsi="Calibri"/>
+          <w:i/>
+          <w:color w:val="3A3A3A"/>
+          <w:sz w:val="22"/>
+        </w:rPr>
+        <w:t>Ôi vậy à. Chị đang đi làm bây giờ à?</w:t>
+      </w:r>
+    </w:p>
+    <w:p>
+      <w:pPr>
+        <w:spacing w:after="160" w:line="312" w:lineRule="auto"/>
+      </w:pPr>
+      <w:r>
+        <w:rPr>
+          <w:rFonts w:ascii="Calibri" w:hAnsi="Calibri"/>
+          <w:b/>
+          <w:color w:val="1F3864"/>
+          <w:sz w:val="22"/>
+        </w:rPr>
+        <w:t xml:space="preserve">Ms Lan: </w:t>
+      </w:r>
+      <w:r>
+        <w:rPr>
+          <w:rFonts w:ascii="Calibri" w:hAnsi="Calibri"/>
+          <w:sz w:val="22"/>
+        </w:rPr>
+        <w:t xml:space="preserve">Yes, I am. Are you going to work too?  </w:t>
+      </w:r>
+      <w:r>
+        <w:rPr>
+          <w:rFonts w:ascii="Calibri" w:hAnsi="Calibri"/>
+          <w:i/>
+          <w:color w:val="3A3A3A"/>
+          <w:sz w:val="22"/>
+        </w:rPr>
+        <w:t>Vâng, đúng vậy. Chị cũng đang đi làm à?</w:t>
+      </w:r>
+    </w:p>
+    <w:p>
+      <w:pPr>
+        <w:spacing w:after="160" w:line="312" w:lineRule="auto"/>
+      </w:pPr>
+      <w:r>
+        <w:rPr>
+          <w:rFonts w:ascii="Calibri" w:hAnsi="Calibri"/>
+          <w:b/>
+          <w:color w:val="1F3864"/>
+          <w:sz w:val="22"/>
+        </w:rPr>
+        <w:t xml:space="preserve">Ms Emma: </w:t>
+      </w:r>
+      <w:r>
+        <w:rPr>
+          <w:rFonts w:ascii="Calibri" w:hAnsi="Calibri"/>
+          <w:sz w:val="22"/>
+        </w:rPr>
+        <w:t xml:space="preserve">Yes, I am. My office is not far from here.  </w:t>
+      </w:r>
+      <w:r>
+        <w:rPr>
+          <w:rFonts w:ascii="Calibri" w:hAnsi="Calibri"/>
+          <w:i/>
+          <w:color w:val="3A3A3A"/>
+          <w:sz w:val="22"/>
+        </w:rPr>
+        <w:t>Vâng. Văn phòng tôi không xa đây lắm.</w:t>
+      </w:r>
+    </w:p>
+    <w:p>
+      <w:pPr>
+        <w:spacing w:after="160" w:line="312" w:lineRule="auto"/>
+      </w:pPr>
+      <w:r>
+        <w:rPr>
+          <w:rFonts w:ascii="Calibri" w:hAnsi="Calibri"/>
+          <w:b/>
+          <w:color w:val="1F3864"/>
+          <w:sz w:val="22"/>
+        </w:rPr>
+        <w:t xml:space="preserve">Ms Lan: </w:t>
+      </w:r>
+      <w:r>
+        <w:rPr>
+          <w:rFonts w:ascii="Calibri" w:hAnsi="Calibri"/>
+          <w:sz w:val="22"/>
+        </w:rPr>
+        <w:t xml:space="preserve">That is good. Mine is a little further away, near the station.  </w:t>
+      </w:r>
+      <w:r>
+        <w:rPr>
+          <w:rFonts w:ascii="Calibri" w:hAnsi="Calibri"/>
+          <w:i/>
+          <w:color w:val="3A3A3A"/>
+          <w:sz w:val="22"/>
+        </w:rPr>
+        <w:t>Vậy tốt quá. Của tôi thì xa hơn một chút, gần ga tàu.</w:t>
+      </w:r>
+    </w:p>
+    <w:p>
+      <w:pPr>
+        <w:spacing w:after="160" w:line="312" w:lineRule="auto"/>
+      </w:pPr>
+      <w:r>
+        <w:rPr>
+          <w:rFonts w:ascii="Calibri" w:hAnsi="Calibri"/>
+          <w:b/>
+          <w:color w:val="1F3864"/>
+          <w:sz w:val="22"/>
+        </w:rPr>
+        <w:t xml:space="preserve">Ms Emma: </w:t>
+      </w:r>
+      <w:r>
+        <w:rPr>
+          <w:rFonts w:ascii="Calibri" w:hAnsi="Calibri"/>
+          <w:sz w:val="22"/>
+        </w:rPr>
+        <w:t xml:space="preserve">I see. Well, I must go now. Have a good day at work, Lan.  </w:t>
+      </w:r>
+      <w:r>
+        <w:rPr>
+          <w:rFonts w:ascii="Calibri" w:hAnsi="Calibri"/>
+          <w:i/>
+          <w:color w:val="3A3A3A"/>
+          <w:sz w:val="22"/>
+        </w:rPr>
+        <w:t>Ra vậy. Thôi, tôi phải đi đây. Chúc chị một ngày làm việc tốt lành, Lan.</w:t>
+      </w:r>
+    </w:p>
+    <w:p>
+      <w:pPr>
+        <w:spacing w:after="160" w:line="312" w:lineRule="auto"/>
+      </w:pPr>
+      <w:r>
+        <w:rPr>
+          <w:rFonts w:ascii="Calibri" w:hAnsi="Calibri"/>
+          <w:b/>
+          <w:color w:val="1F3864"/>
+          <w:sz w:val="22"/>
+        </w:rPr>
+        <w:t xml:space="preserve">Ms Lan: </w:t>
+      </w:r>
+      <w:r>
+        <w:rPr>
+          <w:rFonts w:ascii="Calibri" w:hAnsi="Calibri"/>
+          <w:sz w:val="22"/>
+        </w:rPr>
+        <w:t xml:space="preserve">Thank you, Emma. Have a good day too.  </w:t>
+      </w:r>
+      <w:r>
+        <w:rPr>
+          <w:rFonts w:ascii="Calibri" w:hAnsi="Calibri"/>
+          <w:i/>
+          <w:color w:val="3A3A3A"/>
+          <w:sz w:val="22"/>
+        </w:rPr>
+        <w:t>Cảm ơn Emma. Chúc chị cũng có một ngày tốt lành.</w:t>
+      </w:r>
+    </w:p>
+    <w:p>
+      <w:pPr>
+        <w:spacing w:after="160" w:line="312" w:lineRule="auto"/>
+      </w:pPr>
+      <w:r>
+        <w:rPr>
+          <w:rFonts w:ascii="Calibri" w:hAnsi="Calibri"/>
+          <w:b/>
+          <w:color w:val="1F3864"/>
+          <w:sz w:val="22"/>
+        </w:rPr>
+        <w:t xml:space="preserve">Ms Emma: </w:t>
+      </w:r>
+      <w:r>
+        <w:rPr>
+          <w:rFonts w:ascii="Calibri" w:hAnsi="Calibri"/>
+          <w:sz w:val="22"/>
+        </w:rPr>
+        <w:t xml:space="preserve">Thank you. See you tomorrow morning, maybe.  </w:t>
+      </w:r>
+      <w:r>
+        <w:rPr>
+          <w:rFonts w:ascii="Calibri" w:hAnsi="Calibri"/>
+          <w:i/>
+          <w:color w:val="3A3A3A"/>
+          <w:sz w:val="22"/>
+        </w:rPr>
+        <w:t>Cảm ơn chị. Có khi mai gặp lại chị nhé.</w:t>
+      </w:r>
+    </w:p>
+    <w:p>
+      <w:pPr>
+        <w:spacing w:after="160" w:line="312" w:lineRule="auto"/>
+      </w:pPr>
+      <w:r>
+        <w:rPr>
+          <w:rFonts w:ascii="Calibri" w:hAnsi="Calibri"/>
+          <w:b/>
+          <w:color w:val="1F3864"/>
+          <w:sz w:val="22"/>
+        </w:rPr>
+        <w:t xml:space="preserve">Ms Lan: </w:t>
+      </w:r>
+      <w:r>
+        <w:rPr>
+          <w:rFonts w:ascii="Calibri" w:hAnsi="Calibri"/>
+          <w:sz w:val="22"/>
+        </w:rPr>
+        <w:t xml:space="preserve">Yes, see you tomorrow. Goodbye, Emma!  </w:t>
+      </w:r>
+      <w:r>
+        <w:rPr>
+          <w:rFonts w:ascii="Calibri" w:hAnsi="Calibri"/>
+          <w:i/>
+          <w:color w:val="3A3A3A"/>
+          <w:sz w:val="22"/>
+        </w:rPr>
+        <w:t>Vâng, hẹn gặp lại. Tạm biệt Emma!</w:t>
+      </w:r>
+    </w:p>
+    <w:p>
+      <w:pPr>
+        <w:spacing w:after="160" w:line="312" w:lineRule="auto"/>
+      </w:pPr>
+      <w:r>
+        <w:rPr>
+          <w:rFonts w:ascii="Calibri" w:hAnsi="Calibri"/>
+          <w:b/>
+          <w:color w:val="1F3864"/>
+          <w:sz w:val="22"/>
+        </w:rPr>
+        <w:t xml:space="preserve">Ms Emma: </w:t>
+      </w:r>
+      <w:r>
+        <w:rPr>
+          <w:rFonts w:ascii="Calibri" w:hAnsi="Calibri"/>
+          <w:sz w:val="22"/>
+        </w:rPr>
+        <w:t xml:space="preserve">Goodbye, Lan! Take care.  </w:t>
+      </w:r>
+      <w:r>
+        <w:rPr>
+          <w:rFonts w:ascii="Calibri" w:hAnsi="Calibri"/>
+          <w:i/>
+          <w:color w:val="3A3A3A"/>
+          <w:sz w:val="22"/>
+        </w:rPr>
+        <w:t>Tạm biệt Lan! Chị đi cẩn thận nhé.</w:t>
+      </w:r>
+    </w:p>
+    <w:p>
+      <w:pPr>
+        <w:spacing w:after="160" w:line="312" w:lineRule="auto"/>
+      </w:pPr>
+      <w:r>
+        <w:rPr>
+          <w:rFonts w:ascii="Calibri" w:hAnsi="Calibri"/>
+          <w:b/>
+          <w:color w:val="1F3864"/>
+          <w:sz w:val="22"/>
+        </w:rPr>
+        <w:t xml:space="preserve">Ms Lan: </w:t>
+      </w:r>
+      <w:r>
+        <w:rPr>
+          <w:rFonts w:ascii="Calibri" w:hAnsi="Calibri"/>
+          <w:sz w:val="22"/>
+        </w:rPr>
+        <w:t xml:space="preserve">Hi, Emma! I did not expect to see you again today.  </w:t>
+      </w:r>
+      <w:r>
+        <w:rPr>
+          <w:rFonts w:ascii="Calibri" w:hAnsi="Calibri"/>
+          <w:i/>
+          <w:color w:val="3A3A3A"/>
+          <w:sz w:val="22"/>
+        </w:rPr>
+        <w:t>Ơ, Emma! Chị không nghĩ là gặp lại chị hôm nay đó.</w:t>
+      </w:r>
+    </w:p>
+    <w:p>
+      <w:pPr>
+        <w:spacing w:after="160" w:line="312" w:lineRule="auto"/>
+      </w:pPr>
+      <w:r>
+        <w:rPr>
+          <w:rFonts w:ascii="Calibri" w:hAnsi="Calibri"/>
+          <w:b/>
+          <w:color w:val="1F3864"/>
+          <w:sz w:val="22"/>
+        </w:rPr>
+        <w:t xml:space="preserve">Ms Emma: </w:t>
+      </w:r>
+      <w:r>
+        <w:rPr>
+          <w:rFonts w:ascii="Calibri" w:hAnsi="Calibri"/>
+          <w:sz w:val="22"/>
+        </w:rPr>
+        <w:t xml:space="preserve">Oh, hi, Lan! Good evening. I am just walking home.  </w:t>
+      </w:r>
+      <w:r>
+        <w:rPr>
+          <w:rFonts w:ascii="Calibri" w:hAnsi="Calibri"/>
+          <w:i/>
+          <w:color w:val="3A3A3A"/>
+          <w:sz w:val="22"/>
+        </w:rPr>
+        <w:t>Ơ, chào chị! Chào buổi tối. Tôi đang đi bộ về nhà thôi.</w:t>
+      </w:r>
+    </w:p>
+    <w:p>
+      <w:pPr>
+        <w:spacing w:after="160" w:line="312" w:lineRule="auto"/>
+      </w:pPr>
+      <w:r>
+        <w:rPr>
+          <w:rFonts w:ascii="Calibri" w:hAnsi="Calibri"/>
+          <w:b/>
+          <w:color w:val="1F3864"/>
+          <w:sz w:val="22"/>
+        </w:rPr>
+        <w:t xml:space="preserve">Ms Lan: </w:t>
+      </w:r>
+      <w:r>
+        <w:rPr>
+          <w:rFonts w:ascii="Calibri" w:hAnsi="Calibri"/>
+          <w:sz w:val="22"/>
+        </w:rPr>
+        <w:t xml:space="preserve">Good evening. How was your day at work?  </w:t>
+      </w:r>
+      <w:r>
+        <w:rPr>
+          <w:rFonts w:ascii="Calibri" w:hAnsi="Calibri"/>
+          <w:i/>
+          <w:color w:val="3A3A3A"/>
+          <w:sz w:val="22"/>
+        </w:rPr>
+        <w:t>Chào buổi tối chị. Ngày làm việc của chị thế nào?</w:t>
+      </w:r>
+    </w:p>
+    <w:p>
+      <w:pPr>
+        <w:spacing w:after="160" w:line="312" w:lineRule="auto"/>
+      </w:pPr>
+      <w:r>
+        <w:rPr>
+          <w:rFonts w:ascii="Calibri" w:hAnsi="Calibri"/>
+          <w:b/>
+          <w:color w:val="1F3864"/>
+          <w:sz w:val="22"/>
+        </w:rPr>
+        <w:t xml:space="preserve">Ms Emma: </w:t>
+      </w:r>
+      <w:r>
+        <w:rPr>
+          <w:rFonts w:ascii="Calibri" w:hAnsi="Calibri"/>
+          <w:sz w:val="22"/>
+        </w:rPr>
+        <w:t xml:space="preserve">It was busy, but good, thank you. And yours?  </w:t>
+      </w:r>
+      <w:r>
+        <w:rPr>
+          <w:rFonts w:ascii="Calibri" w:hAnsi="Calibri"/>
+          <w:i/>
+          <w:color w:val="3A3A3A"/>
+          <w:sz w:val="22"/>
+        </w:rPr>
+        <w:t>Cũng bận, nhưng ổn, cảm ơn chị. Còn chị thì sao?</w:t>
+      </w:r>
+    </w:p>
+    <w:p>
+      <w:pPr>
+        <w:spacing w:after="160" w:line="312" w:lineRule="auto"/>
+      </w:pPr>
+      <w:r>
+        <w:rPr>
+          <w:rFonts w:ascii="Calibri" w:hAnsi="Calibri"/>
+          <w:b/>
+          <w:color w:val="1F3864"/>
+          <w:sz w:val="22"/>
+        </w:rPr>
+        <w:t xml:space="preserve">Ms Lan: </w:t>
+      </w:r>
+      <w:r>
+        <w:rPr>
+          <w:rFonts w:ascii="Calibri" w:hAnsi="Calibri"/>
+          <w:sz w:val="22"/>
+        </w:rPr>
+        <w:t xml:space="preserve">Mine was good too. I am glad it is the evening now.  </w:t>
+      </w:r>
+      <w:r>
+        <w:rPr>
+          <w:rFonts w:ascii="Calibri" w:hAnsi="Calibri"/>
+          <w:i/>
+          <w:color w:val="3A3A3A"/>
+          <w:sz w:val="22"/>
+        </w:rPr>
+        <w:t>Của tôi cũng ổn. Tôi mừng là đã đến buổi tối rồi.</w:t>
+      </w:r>
+    </w:p>
+    <w:p>
+      <w:pPr>
+        <w:spacing w:after="160" w:line="312" w:lineRule="auto"/>
+      </w:pPr>
+      <w:r>
+        <w:rPr>
+          <w:rFonts w:ascii="Calibri" w:hAnsi="Calibri"/>
+          <w:b/>
+          <w:color w:val="1F3864"/>
+          <w:sz w:val="22"/>
+        </w:rPr>
+        <w:t xml:space="preserve">Ms Emma: </w:t>
+      </w:r>
+      <w:r>
+        <w:rPr>
+          <w:rFonts w:ascii="Calibri" w:hAnsi="Calibri"/>
+          <w:sz w:val="22"/>
+        </w:rPr>
+        <w:t xml:space="preserve">Me too. Good night, Lan. Sleep well.  </w:t>
+      </w:r>
+      <w:r>
+        <w:rPr>
+          <w:rFonts w:ascii="Calibri" w:hAnsi="Calibri"/>
+          <w:i/>
+          <w:color w:val="3A3A3A"/>
+          <w:sz w:val="22"/>
+        </w:rPr>
+        <w:t>Tôi cũng vậy. Chúc chị ngủ ngon, Lan.</w:t>
+      </w:r>
+    </w:p>
+    <w:p>
+      <w:pPr>
+        <w:spacing w:after="160" w:line="312" w:lineRule="auto"/>
+      </w:pPr>
+      <w:r>
+        <w:rPr>
+          <w:rFonts w:ascii="Calibri" w:hAnsi="Calibri"/>
+          <w:b/>
+          <w:color w:val="1F3864"/>
+          <w:sz w:val="22"/>
+        </w:rPr>
+        <w:t xml:space="preserve">Ms Lan: </w:t>
+      </w:r>
+      <w:r>
+        <w:rPr>
+          <w:rFonts w:ascii="Calibri" w:hAnsi="Calibri"/>
+          <w:sz w:val="22"/>
+        </w:rPr>
+        <w:t xml:space="preserve">Good night, Emma. See you soon.  </w:t>
+      </w:r>
+      <w:r>
+        <w:rPr>
+          <w:rFonts w:ascii="Calibri" w:hAnsi="Calibri"/>
+          <w:i/>
+          <w:color w:val="3A3A3A"/>
+          <w:sz w:val="22"/>
+        </w:rPr>
+        <w:t>Chúc chị ngủ ngon, Emma. Hẹn gặp lại sớm nhé.</w:t>
+      </w:r>
+    </w:p>
     <w:sectPr>
-      <w:footerReference w:type="default" r:id="rId9"/>
+      <w:footerReference w:type="default" r:id="rId10"/>
       <w:pgSz w:w="11906" w:h="16838"/>
       <w:pgMar w:top="1020" w:right="1134" w:bottom="1020" w:left="1134" w:header="720" w:footer="720" w:gutter="0"/>
       <w:cols w:space="720"/>
@@ -819,6 +1652,30 @@
         <w:sz w:val="16"/>
       </w:rPr>
       <w:t xml:space="preserve">EVERYDAY ENGLISH REFLEX  •  Personal Identity  •  page </w:t>
+    </w:r>
+    <w:r>
+      <w:fldChar w:fldCharType="begin"/>
+      <w:instrText xml:space="preserve">PAGE</w:instrText>
+      <w:fldChar w:fldCharType="end"/>
+    </w:r>
+  </w:p>
+</w:ftr>
+</file>
+
+<file path=word/footer2.xml><?xml version="1.0" encoding="utf-8"?>
+<w:ftr xmlns:m="http://schemas.openxmlformats.org/officeDocument/2006/math" xmlns:mc="http://schemas.openxmlformats.org/markup-compatibility/2006" xmlns:mo="http://schemas.microsoft.com/office/mac/office/2008/main" xmlns:mv="urn:schemas-microsoft-com:mac:vml" xmlns:o="urn:schemas-microsoft-com:office:office" xmlns:r="http://schemas.openxmlformats.org/officeDocument/2006/relationships" xmlns:v="urn:schemas-microsoft-com:vml" xmlns:w10="urn:schemas-microsoft-com:office:word" xmlns:w14="http://schemas.microsoft.com/office/word/2010/wordml" xmlns:w="http://schemas.openxmlformats.org/wordprocessingml/2006/main" xmlns:wne="http://schemas.microsoft.com/office/word/2006/wordml" xmlns:wp14="http://schemas.microsoft.com/office/word/2010/wordprocessingDrawing" xmlns:wp="http://schemas.openxmlformats.org/drawingml/2006/wordprocessingDrawing" xmlns:wpc="http://schemas.microsoft.com/office/word/2010/wordprocessingCanvas" xmlns:wpg="http://schemas.microsoft.com/office/word/2010/wordprocessingGroup" xmlns:wpi="http://schemas.microsoft.com/office/word/2010/wordprocessingInk" xmlns:wps="http://schemas.microsoft.com/office/word/2010/wordprocessingShape" mc:Ignorable="w14 wp14">
+  <w:p>
+    <w:pPr>
+      <w:pStyle w:val="Footer"/>
+      <w:jc w:val="center"/>
+    </w:pPr>
+    <w:r/>
+    <w:r>
+      <w:rPr>
+        <w:color w:val="666666"/>
+        <w:sz w:val="16"/>
+      </w:rPr>
+      <w:t xml:space="preserve">EVERYDAY ENGLISH REFLEX  •  Social Basics  •  page </w:t>
     </w:r>
     <w:r>
       <w:fldChar w:fldCharType="begin"/>

</xml_diff>